<commit_message>
feat: add real certificates (Techfest IIT Bombay, TechnoXian, Coursera) and exact resume generator
</commit_message>
<xml_diff>
--- a/server/assets/Devansh_Pundir_Resume.docx
+++ b/server/assets/Devansh_Pundir_Resume.docx
@@ -7,7 +7,7 @@
         <w:pStyle w:val="Title"/>
       </w:pPr>
       <w:r>
-        <w:t xml:space="preserve">DEVANSH PUNDIR</w:t>
+        <w:t xml:space="preserve">Devansh Pundir</w:t>
       </w:r>
     </w:p>
     <w:p>
@@ -16,49 +16,21 @@
           <w:b/>
           <w:bCs/>
         </w:rPr>
-        <w:t xml:space="preserve">Full-Stack MERN Developer &amp; Embedded Hardware Engineer
-</w:t>
-      </w:r>
-      <w:r>
-        <w:t xml:space="preserve">Email: devanshpundir477@gmail.com | Location: India
-</w:t>
-      </w:r>
-      <w:r>
-        <w:t xml:space="preserve">GitHub: https://github.com/Devanshpundir-code
-</w:t>
-      </w:r>
-    </w:p>
-    <w:p>
-      <w:pPr>
-        <w:pStyle w:val="Heading1"/>
-      </w:pPr>
-      <w:r>
-        <w:t xml:space="preserve">PROFESSIONAL SUMMARY</w:t>
-      </w:r>
-    </w:p>
-    <w:p>
-      <w:r>
-        <w:t xml:space="preserve">Results-driven developer with expertise spanning full-stack web applications (React.js, Node.js, Express.js, MongoDB) and embedded robotics systems (PCB design, microcontrollers, ROS2, Gazebo). Demonstrated ability to architect resilient backend REST APIs and responsive, visually distinctive frontend interfaces.</w:t>
-      </w:r>
-    </w:p>
-    <w:p>
-      <w:pPr>
-        <w:pStyle w:val="Heading1"/>
-      </w:pPr>
-      <w:r>
-        <w:t xml:space="preserve">TECHNICAL SKILLS</w:t>
-      </w:r>
-    </w:p>
-    <w:p>
+        <w:t xml:space="preserve">LinkedIn: </w:t>
+      </w:r>
+      <w:r>
+        <w:t xml:space="preserve">https://www.linkedin.com/in/devansh-pundir-41a086233/
+</w:t>
+      </w:r>
       <w:r>
         <w:rPr>
           <w:b/>
           <w:bCs/>
         </w:rPr>
-        <w:t xml:space="preserve">• Frontend: </w:t>
-      </w:r>
-      <w:r>
-        <w:t xml:space="preserve">React.js, JavaScript (ES6+), React Router, HTML5, CSS3, Responsive Design
+        <w:t xml:space="preserve">Email-id: </w:t>
+      </w:r>
+      <w:r>
+        <w:t xml:space="preserve">devanshpundir477@gmail.com
 </w:t>
       </w:r>
       <w:r>
@@ -66,10 +38,10 @@
           <w:b/>
           <w:bCs/>
         </w:rPr>
-        <w:t xml:space="preserve">• Backend &amp; DB: </w:t>
-      </w:r>
-      <w:r>
-        <w:t xml:space="preserve">Node.js, Express.js, REST API Architecture, MongoDB, Mongoose
+        <w:t xml:space="preserve">Mobile: </w:t>
+      </w:r>
+      <w:r>
+        <w:t xml:space="preserve">+91 8434950370
 </w:t>
       </w:r>
       <w:r>
@@ -77,50 +49,119 @@
           <w:b/>
           <w:bCs/>
         </w:rPr>
-        <w:t xml:space="preserve">• Hardware &amp; Embedded: </w:t>
-      </w:r>
-      <w:r>
-        <w:t xml:space="preserve">PCB Schematic Design, EasyEDA, Autodesk Fusion 360, Arduino IDE, ROS2, Gazebo
-</w:t>
-      </w:r>
+        <w:t xml:space="preserve">GitHub: </w:t>
+      </w:r>
+      <w:r>
+        <w:t xml:space="preserve">https://github.com/Devanshpundir-code
+</w:t>
+      </w:r>
+    </w:p>
+    <w:p>
+      <w:pPr>
+        <w:pStyle w:val="Heading1"/>
+      </w:pPr>
+      <w:r>
+        <w:t xml:space="preserve">EDUCATION</w:t>
+      </w:r>
+    </w:p>
+    <w:p>
+      <w:r>
+        <w:t xml:space="preserve">• Pursuing BTECH-CSE from JK Lakshmipat University Jaipur (4th Semester)
+</w:t>
+      </w:r>
+    </w:p>
+    <w:p>
+      <w:pPr>
+        <w:pStyle w:val="Heading1"/>
+      </w:pPr>
+      <w:r>
+        <w:t xml:space="preserve">FIELDS OF INTEREST</w:t>
+      </w:r>
+    </w:p>
+    <w:p>
+      <w:r>
+        <w:t xml:space="preserve">• Building http://www.dyoraarobotics.in (A competitive robotics parts website)
+</w:t>
+      </w:r>
+      <w:r>
+        <w:t xml:space="preserve">• Embedded systems, C++ programming, Competitive robotics, industrial robotics
+</w:t>
+      </w:r>
+      <w:r>
+        <w:t xml:space="preserve">• Machine learning and AI applications
+</w:t>
+      </w:r>
+    </w:p>
+    <w:p>
+      <w:pPr>
+        <w:pStyle w:val="Heading1"/>
+      </w:pPr>
+      <w:r>
+        <w:t xml:space="preserve">TECHNICAL SKILLS</w:t>
+      </w:r>
+    </w:p>
+    <w:p>
+      <w:r>
+        <w:t xml:space="preserve">• Proficient in Python, C, and C++ for embedded systems development, PCB designing, Circuit designing, ROS2, Gazebo, and Rviz, Machine learning, computer vision, scikit-learn and OpenCV
+</w:t>
+      </w:r>
+    </w:p>
+    <w:p>
+      <w:pPr>
+        <w:pStyle w:val="Heading1"/>
+      </w:pPr>
+      <w:r>
+        <w:t xml:space="preserve">MAJOR PROJECTS</w:t>
+      </w:r>
+    </w:p>
+    <w:p>
       <w:r>
         <w:rPr>
           <w:b/>
           <w:bCs/>
         </w:rPr>
-        <w:t xml:space="preserve">• Tools &amp; Platforms: </w:t>
-      </w:r>
-      <w:r>
-        <w:t xml:space="preserve">Git, GitHub, Postman, Linux/Ubuntu, VS Code, Vercel, Render</w:t>
-      </w:r>
-    </w:p>
-    <w:p>
-      <w:pPr>
-        <w:pStyle w:val="Heading1"/>
-      </w:pPr>
-      <w:r>
-        <w:t xml:space="preserve">EXPERIENCE</w:t>
-      </w:r>
-    </w:p>
-    <w:p>
+        <w:t xml:space="preserve">Robotics Projects:
+</w:t>
+      </w:r>
+      <w:r>
+        <w:t xml:space="preserve">• Developed a CNC writing plotter integrated with a web interface, Duration (20/07/2025 ~ 30/07/2025)
+</w:t>
+      </w:r>
+      <w:r>
+        <w:t xml:space="preserve">• Made a custom 16 channel infrared sensor array with complete custom robot, Duration (14/09/2025), Documented: https://rb.gy/ybsmlq
+</w:t>
+      </w:r>
+      <w:r>
+        <w:t xml:space="preserve">• Participated and won many robotics competitions (Detailed described: https://rb.gy/akng2d)
+</w:t>
+      </w:r>
+      <w:r>
+        <w:t xml:space="preserve">• Built a face recognition–based automatic security door system, Duration (20/02/2025 ~ 24/02/2025)
+</w:t>
+      </w:r>
       <w:r>
         <w:rPr>
           <w:b/>
           <w:bCs/>
         </w:rPr>
-        <w:t xml:space="preserve">Embedded Systems &amp; PCB Design Intern - Dyoraa Robotics
-</w:t>
-      </w:r>
-      <w:r>
-        <w:t xml:space="preserve">• Designed high-current multi-layer PCBs and carrier boards for autonomous robots.
-</w:t>
-      </w:r>
-      <w:r>
-        <w:t xml:space="preserve">• Implemented sensor multiplexer arrays and motor-control driver circuits (DRV8874).
-</w:t>
-      </w:r>
-      <w:r>
-        <w:t xml:space="preserve">• Developed firmware and motion control logic integrated with ROS2 and Gazebo simulation.</w:t>
+        <w:t xml:space="preserve">Machine Learning Projects:
+</w:t>
+      </w:r>
+      <w:r>
+        <w:t xml:space="preserve">• Fish Species Predictor: Used Random Forest to classify fish species based on physical features
+</w:t>
+      </w:r>
+      <w:r>
+        <w:t xml:space="preserve">• Handwritten Digit Recognition: Achieved 98% accuracy using CNN on the MNIST dataset
+</w:t>
+      </w:r>
+      <w:r>
+        <w:t xml:space="preserve">• Attendance-Based Class Prediction: Created a Random Forest model to predict class attendance using 50 days of personal data
+</w:t>
+      </w:r>
+      <w:r>
+        <w:t xml:space="preserve">(ALL Projects are available at GitHub)
+</w:t>
       </w:r>
     </w:p>
     <w:p>
@@ -128,65 +169,25 @@
         <w:pStyle w:val="Heading1"/>
       </w:pPr>
       <w:r>
-        <w:t xml:space="preserve">FEATURED PROJECTS</w:t>
-      </w:r>
-    </w:p>
-    <w:p>
-      <w:r>
-        <w:rPr>
-          <w:b/>
-          <w:bCs/>
-        </w:rPr>
-        <w:t xml:space="preserve">1. Night Fury High-Speed Autonomous Robot
-</w:t>
-      </w:r>
-      <w:r>
-        <w:t xml:space="preserve">Custom high-current PCB carrier, 16-channel sensor array, custom firmware algorithms.
-</w:t>
-      </w:r>
-      <w:r>
-        <w:rPr>
-          <w:b/>
-          <w:bCs/>
-        </w:rPr>
-        <w:t xml:space="preserve">2. MERN Incident Reporting &amp; Store Platform
-</w:t>
-      </w:r>
-      <w:r>
-        <w:t xml:space="preserve">Full-stack REST API with Express, Mongoose schema validation, React single-page frontend.
-</w:t>
-      </w:r>
-      <w:r>
-        <w:rPr>
-          <w:b/>
-          <w:bCs/>
-        </w:rPr>
-        <w:t xml:space="preserve">3. Hand-Drawn Personal Portfolio Website
-</w:t>
-      </w:r>
-      <w:r>
-        <w:t xml:space="preserve">Black-and-white sketch visual identity, React Router SPA, Express resume download streams, MongoDB contact persistence.</w:t>
-      </w:r>
-    </w:p>
-    <w:p>
-      <w:pPr>
-        <w:pStyle w:val="Heading1"/>
-      </w:pPr>
-      <w:r>
-        <w:t xml:space="preserve">EDUCATION</w:t>
-      </w:r>
-    </w:p>
-    <w:p>
-      <w:r>
-        <w:rPr>
-          <w:b/>
-          <w:bCs/>
-        </w:rPr>
-        <w:t xml:space="preserve">Bachelor of Technology (B.Tech) in Computer Science / Engineering
-</w:t>
-      </w:r>
-      <w:r>
-        <w:t xml:space="preserve">Coursework: Data Structures, Database Management Systems, Web Development, Microprocessors.</w:t>
+        <w:t xml:space="preserve">CERTIFICATIONS &amp; ACHIEVEMENTS</w:t>
+      </w:r>
+    </w:p>
+    <w:p>
+      <w:r>
+        <w:t xml:space="preserve">• Techfest, IIT Bombay: Certificate of Excellence, 5th position in Meshmerize competition (Delhi Zone, Oct 2025)
+</w:t>
+      </w:r>
+      <w:r>
+        <w:t xml:space="preserve">• TechnoXian World Cup 2025: Certificate of Appreciation, Open For All Fastest Line Follower Challenge, Noida Stadium (Aug-Sep 2025)
+</w:t>
+      </w:r>
+      <w:r>
+        <w:t xml:space="preserve">• Coursera: Python for Data Analysis: Pandas &amp; NumPy (Mar 2025, Verify: https://coursera.org/verify/DWZOGEY7OU5Y)
+</w:t>
+      </w:r>
+      <w:r>
+        <w:t xml:space="preserve">• University of Michigan / Coursera: Exploring C (May 2025, Verify: https://coursera.org/verify/1S167XI2WQB7)
+</w:t>
       </w:r>
     </w:p>
     <w:sectPr>

</xml_diff>

<commit_message>
feat: add Techfest IIT Bombay Finals 6th position certificate and update resume downloads
</commit_message>
<xml_diff>
--- a/server/assets/Devansh_Pundir_Resume.docx
+++ b/server/assets/Devansh_Pundir_Resume.docx
@@ -173,6 +173,10 @@
       </w:r>
     </w:p>
     <w:p>
+      <w:r>
+        <w:t xml:space="preserve">• Techfest, IIT Bombay: Certificate of Excellence, 6th position nationwide in Meshmerize competition (Dec 2025)
+</w:t>
+      </w:r>
       <w:r>
         <w:t xml:space="preserve">• Techfest, IIT Bombay: Certificate of Excellence, 5th position in Meshmerize competition (Delhi Zone, Oct 2025)
 </w:t>

</xml_diff>